<commit_message>
Ajustar documento semana 4
</commit_message>
<xml_diff>
--- a/docs/Desarrollo_proyecto_grupo8_semana4.docx
+++ b/docs/Desarrollo_proyecto_grupo8_semana4.docx
@@ -5805,6 +5805,70 @@
           <w:sz w:val="22"/>
         </w:rPr>
         <w:t xml:space="preserve"> garantiza que un apoderado solo consulte datos de sus estudiantes vinculados, previniendo acceso cruzado a información de terceros.</w:t>
+      </w:r>
+    </w:p>
+    <w:p>
+      <w:r>
+        <w:rPr>
+          <w:b/>
+        </w:rPr>
+        <w:t>Aclaraci?n posterior a retroalimentaci?n docente</w:t>
+      </w:r>
+    </w:p>
+    <w:p>
+      <w:r>
+        <w:rPr>
+          <w:b/>
+        </w:rPr>
+        <w:t xml:space="preserve">Profesor jefe vs profesor regular: </w:t>
+      </w:r>
+      <w:r>
+        <w:rPr>
+          <w:b w:val="0"/>
+        </w:rPr>
+        <w:t>para el MVP Semana 4 se us? el rol PROFESOR como equivalente funcional al profesor jefe responsable de curso. La responsabilidad se infiere por la asignaci?n en course_teachers y por la vinculaci?n con cursos/asignaturas. No existe todav?a un campo booleano is_head_teacher ni un subtipo de profesor; por tanto, en el dise?o actual todos los profesores asignados a un curso comparten las mismas capacidades dentro de ese curso. Si se requiere distinguir profesor regular y profesor jefe, la correcci?n de modelo propuesta es extender course_teachers con un campo role_in_course o is_head_teacher.</w:t>
+      </w:r>
+    </w:p>
+    <w:p>
+      <w:r>
+        <w:rPr>
+          <w:b/>
+        </w:rPr>
+        <w:t xml:space="preserve">Rol COLEGIO: </w:t>
+      </w:r>
+      <w:r>
+        <w:rPr>
+          <w:b w:val="0"/>
+        </w:rPr>
+        <w:t>se mantiene como perfil institucional derivado de la necesidad de gestionar publicaciones del colegio, cursos, calendario institucional, usuarios acad?micos y reportes. No reemplaza a ADMIN: ADMIN conserva administraci?n global del sistema, mientras COLEGIO representa operaci?n institucional. Si el docente solicita ajustarse estrictamente a los cuatro roles m?nimos, este perfil puede consolidarse como permisos administrativos institucionales.</w:t>
+      </w:r>
+    </w:p>
+    <w:p>
+      <w:r>
+        <w:rPr>
+          <w:b/>
+        </w:rPr>
+        <w:t xml:space="preserve">Superusuario del chat curso: </w:t>
+      </w:r>
+      <w:r>
+        <w:rPr>
+          <w:b w:val="0"/>
+        </w:rPr>
+        <w:t>en esta entrega el chat se documenta como experimental/post-MVP. El script conserva created_by_id para identificar al creador de la sala, pero no implementa permisos granulares de moderaci?n. Para cubrir completamente el concepto de superusuario, la siguiente iteraci?n debe modelar permisos de moderaci?n, por ejemplo con moderator_user_id o una tabla chat_room_members con rol MODERATOR/PARTICIPANT, adem?s de campos como status, closed_at, deleted_by_id o deleted_at para cierre y eliminaci?n controlada de mensajes.</w:t>
+      </w:r>
+    </w:p>
+    <w:p>
+      <w:r>
+        <w:rPr>
+          <w:b/>
+        </w:rPr>
+        <w:t xml:space="preserve">Acceso del apoderado al chat: </w:t>
+      </w:r>
+      <w:r>
+        <w:rPr>
+          <w:b w:val="0"/>
+        </w:rPr>
+        <w:t>el muro acad?mico no equivale al chat. El muro corresponde a posts/comments, mientras que chat_rooms/chat_messages modelan mensajer?a. Por eso el dashboard del apoderado no muestra chat como flujo principal en los mockups Semana 4. Si el requisito se mantiene dentro del alcance, la correcci?n de dise?o es incorporar una opci?n ?Mensajes/Chat? para APODERADO, visible solo cuando exista una sala iniciada por el profesor responsable del curso o estudiante vinculado.</w:t>
       </w:r>
     </w:p>
     <w:p>

</xml_diff>